<commit_message>
Improved core application features, services, and UI components
</commit_message>
<xml_diff>
--- a/Ty-Code_Architecture_and_Interview_Guide.docx
+++ b/Ty-Code_Architecture_and_Interview_Guide.docx
@@ -567,6 +567,255 @@
         <w:t>2. 24ms Throttle Window: A requestAnimationFrame throttle synchronizes UI updates with the 60Hz display refresh cycle.</w:t>
         <w:br/>
         <w:t>3. Deferred Markdown Parsing: Raw text displays immediately during streaming. Full syntax highlighting and markdown parsing run only after the stream finishes.</w:t>
+      </w:r>
+    </w:p>
+    <w:p>
+      <w:pPr>
+        <w:keepNext/>
+        <w:spacing w:before="200" w:after="60"/>
+      </w:pPr>
+      <w:r>
+        <w:rPr>
+          <w:rFonts w:ascii="Segoe UI" w:hAnsi="Segoe UI"/>
+          <w:b/>
+          <w:color w:val="0F172A"/>
+          <w:sz w:val="23"/>
+        </w:rPr>
+        <w:t>Q: How do you minimize Time-to-First-Token (TTFT) and optimize end-to-end streaming latency?</w:t>
+      </w:r>
+    </w:p>
+    <w:p>
+      <w:pPr>
+        <w:spacing w:after="80"/>
+      </w:pPr>
+      <w:r>
+        <w:rPr>
+          <w:i/>
+          <w:color w:val="64748B"/>
+          <w:sz w:val="19"/>
+        </w:rPr>
+        <w:t>Focus Area: Latency Optimization &amp; Network Architecture</w:t>
+      </w:r>
+    </w:p>
+    <w:p>
+      <w:pPr>
+        <w:spacing w:after="200"/>
+      </w:pPr>
+      <w:r>
+        <w:rPr>
+          <w:sz w:val="21"/>
+        </w:rPr>
+        <w:t>To deliver instantaneous visual feedback without compromising throughput, Ty-Code optimizes latency across three critical tiers:</w:t>
+        <w:br/>
+        <w:br/>
+        <w:t>1. Main Process Outbound Coalescing with Immediate Chunk #1 Flush:</w:t>
+        <w:br/>
+        <w:t>Tokens stream from AI providers through the Main process. Instead of blasting IPC messages per token, tokens coalesce into 16–24ms batches. Crucially, Chunk #1 bypasses batching and flushes synchronously across IPC in 0ms. This ensures Time-to-First-Token (TTFT) is minimal while eliminating IPC serialization overhead during sustained 300+ token/s bursts.</w:t>
+        <w:br/>
+        <w:br/>
+        <w:t>2. Per-Host HTTPS Connection Pooling (keepAlive: true):</w:t>
+        <w:br/>
+        <w:t>ProviderGateway maintains persistent HTTPS agents and Undici dispatchers per provider host with keepAlive: true, 15-second keepalive timeouts, and socket reuse. Sequential prompts reuse active TLS sessions and TCP connections, saving 80 to 250ms of handshake latency per request.</w:t>
+        <w:br/>
+        <w:br/>
+        <w:t>3. CSS Layout Containment &amp; Virtualization:</w:t>
+        <w:br/>
+        <w:t>Message rows are virtualized via @tanstack/react-virtual and isolated with React.memo. Each message container applies content-visibility: auto and contain-intrinsic-size: auto 130px. Off-screen conversation turns completely bypass layout and paint calculations until scrolled into view.</w:t>
+        <w:br/>
+        <w:br/>
+        <w:t>4. Deferred AST Syntax Highlighting:</w:t>
+        <w:br/>
+        <w:t>During live streaming, messages render raw text through ScrambleText. Heavy markdown AST construction and highlight.js tokenization run only once upon receiving the [DONE] stream termination token.</w:t>
+      </w:r>
+    </w:p>
+    <w:p>
+      <w:pPr>
+        <w:keepNext/>
+        <w:spacing w:before="200" w:after="60"/>
+      </w:pPr>
+      <w:r>
+        <w:rPr>
+          <w:rFonts w:ascii="Segoe UI" w:hAnsi="Segoe UI"/>
+          <w:b/>
+          <w:color w:val="0F172A"/>
+          <w:sz w:val="23"/>
+        </w:rPr>
+        <w:t>Q: Explain the Smart Sticky-Scroll Auto-Follow algorithm and how you prevented layout jumps and per-pixel re-renders.</w:t>
+      </w:r>
+    </w:p>
+    <w:p>
+      <w:pPr>
+        <w:spacing w:after="80"/>
+      </w:pPr>
+      <w:r>
+        <w:rPr>
+          <w:i/>
+          <w:color w:val="64748B"/>
+          <w:sz w:val="19"/>
+        </w:rPr>
+        <w:t>Focus Area: UI Engineering &amp; DOM Synchronization</w:t>
+      </w:r>
+    </w:p>
+    <w:p>
+      <w:pPr>
+        <w:spacing w:after="200"/>
+      </w:pPr>
+      <w:r>
+        <w:rPr>
+          <w:sz w:val="21"/>
+        </w:rPr>
+        <w:t>Implementing auto-scrolling during high-speed AI streaming is fraught with edge cases: programmatic smooth scrolling queues animations, deferred markdown highlighting shifts container heights, and reading scroll position in React state causes catastrophic per-pixel re-renders.</w:t>
+        <w:br/>
+        <w:br/>
+        <w:t>We designed a multi-layer Smart Sticky-Scroll architecture in ChatMessageList:</w:t>
+        <w:br/>
+        <w:br/>
+        <w:t>1. Ref-Based Pin Detection (Zero Re-render Cost):</w:t>
+        <w:br/>
+        <w:t>We track pinned state using const pinnedToBottom = useRef(true). A { passive: true } scroll listener throttled by requestAnimationFrame computes distanceFromBottom = el.scrollHeight - el.scrollTop - el.clientHeight. The user is considered pinned when distanceFromBottom &lt; 64px. A single piece of React state (detachedFromBottom) flips ONLY when the boolean changes value, guaranteeing zero React re-renders while scrolling.</w:t>
+        <w:br/>
+        <w:br/>
+        <w:t>2. Auto-Follow on Buffer Flush (Behavior: 'auto'):</w:t>
+        <w:br/>
+        <w:t>After each 24ms double-buffered flush commits text to the DOM, if pinnedToBottom.current is true, el.scrollTop = el.scrollHeight executes using behavior 'auto'. Programmatic smooth scrolling is strictly prohibited during streaming because queued browser animations cause visual jitter and artificial lag.</w:t>
+        <w:br/>
+        <w:br/>
+        <w:t>3. ResizeObserver Height Protection:</w:t>
+        <w:br/>
+        <w:t>A ResizeObserver monitors the inner virtual container. When post-stream events (syntax highlighting on [DONE], code block expansion, image loading) increase document height while pinned, the observer re-pins scrollTop immediately. If the user is detached (reading previous messages), the observer exits immediately, preventing jarring layout jumps.</w:t>
+        <w:br/>
+        <w:br/>
+        <w:t>4. Floating 'Jump to latest' Pill &amp; Re-Pin Events:</w:t>
+        <w:br/>
+        <w:t>When detachedFromBottom is true, a floating pill with an ArrowDown icon and backdrop blur appears bottom-center. Clicking the pill or submitting a new message forces pinnedToBottom.current = true and triggers a smooth scroll to the bottom. Scrolling manually back within 64px automatically hides the pill.</w:t>
+      </w:r>
+    </w:p>
+    <w:p>
+      <w:pPr>
+        <w:keepNext/>
+        <w:spacing w:before="200" w:after="60"/>
+      </w:pPr>
+      <w:r>
+        <w:rPr>
+          <w:rFonts w:ascii="Segoe UI" w:hAnsi="Segoe UI"/>
+          <w:b/>
+          <w:color w:val="0F172A"/>
+          <w:sz w:val="23"/>
+        </w:rPr>
+        <w:t>Q: How does the Matrix Decode glyph-scramble animation work, and how did you guarantee zero latency?</w:t>
+      </w:r>
+    </w:p>
+    <w:p>
+      <w:pPr>
+        <w:spacing w:after="80"/>
+      </w:pPr>
+      <w:r>
+        <w:rPr>
+          <w:i/>
+          <w:color w:val="64748B"/>
+          <w:sz w:val="19"/>
+        </w:rPr>
+        <w:t>Focus Area: Animation Performance &amp; Accessibility</w:t>
+      </w:r>
+    </w:p>
+    <w:p>
+      <w:pPr>
+        <w:spacing w:after="200"/>
+      </w:pPr>
+      <w:r>
+        <w:rPr>
+          <w:sz w:val="21"/>
+        </w:rPr>
+        <w:t>To provide a tactile visual aesthetic during token streaming, we built a 'Matrix Decode' glyph-scramble animation (ScrambleText).</w:t>
+        <w:br/>
+        <w:br/>
+        <w:t>1. Provably Zero Latency:</w:t>
+        <w:br/>
+        <w:t>The animation never gates, buffers, delays, or re-requests tokens. It is strictly a decoupled presentation transform operating on text already committed to the render buffer. Tokens are painted into memory immediately.</w:t>
+        <w:br/>
+        <w:br/>
+        <w:t>2. Per-Character Dynamic Lock Formula:</w:t>
+        <w:br/>
+        <w:t>When character index i first appears in the text buffer, it is assigned a lock timestamp:</w:t>
+        <w:br/>
+        <w:t>lockAt = now + 90ms + (i % 5) * 12ms</w:t>
+        <w:br/>
+        <w:t>On each animation frame, characters where lockAt &lt;= now render as their real glyph. Unlocked characters render a pseudo-random glyph from a Katakana and hex charset ('アイウエオカキクケコサシスセソ0123456789ABCDEF#$%&amp;'). Whitespace and newlines are never scrambled to prevent word-wrap shifts.</w:t>
+        <w:br/>
+        <w:br/>
+        <w:t>3. Bounded O(1) Trailing Window:</w:t>
+        <w:br/>
+        <w:t>To prevent CPU degradation on long responses, scrambling is strictly bounded to the trailing 200 characters (SCRAMBLE_WINDOW = 200). All older characters render permanently locked with zero per-frame CPU computation.</w:t>
+        <w:br/>
+        <w:br/>
+        <w:t>4. Lifecycle &amp; Accessibility Guards:</w:t>
+        <w:br/>
+        <w:t>• Single Self-Cancelling rAF Loop: Starts only when unlocked characters exist and auto-terminates when all characters lock or upon unmount.</w:t>
+        <w:br/>
+        <w:t>• Tab Visibility Guard: Automatically pauses the rAF loop when document.hidden is true.</w:t>
+        <w:br/>
+        <w:t>• Reduced Motion: Respects prefers-reduced-motion: reduce by immediately rendering locked text.</w:t>
+        <w:br/>
+        <w:t>• Accessibility: Uses aria-label={text} and aria-live='off' so screen readers receive clean canonical prose without scrambled characters.</w:t>
+      </w:r>
+    </w:p>
+    <w:p>
+      <w:pPr>
+        <w:keepNext/>
+        <w:spacing w:before="200" w:after="60"/>
+      </w:pPr>
+      <w:r>
+        <w:rPr>
+          <w:rFonts w:ascii="Segoe UI" w:hAnsi="Segoe UI"/>
+          <w:b/>
+          <w:color w:val="0F172A"/>
+          <w:sz w:val="23"/>
+        </w:rPr>
+        <w:t>Q: How does Ty-Code enforce enterprise typography and code-safe UK English punctuation?</w:t>
+      </w:r>
+    </w:p>
+    <w:p>
+      <w:pPr>
+        <w:spacing w:after="80"/>
+      </w:pPr>
+      <w:r>
+        <w:rPr>
+          <w:i/>
+          <w:color w:val="64748B"/>
+          <w:sz w:val="19"/>
+        </w:rPr>
+        <w:t>Focus Area: Typography &amp; Natural Language Normalization</w:t>
+      </w:r>
+    </w:p>
+    <w:p>
+      <w:pPr>
+        <w:spacing w:after="200"/>
+      </w:pPr>
+      <w:r>
+        <w:rPr>
+          <w:sz w:val="21"/>
+        </w:rPr>
+        <w:t>Enterprise communication demands consistent typography, rich markdown presentations, and professional punctuation style without corrupting source code.</w:t>
+        <w:br/>
+        <w:br/>
+        <w:t>1. Zustand Typography System (useTypographyStore):</w:t>
+        <w:br/>
+        <w:t>Exposes persistent settings for chatFontFamily ('sans', 'serif', 'mono', 'plex'), chatFontSize (12–18px, default 14), matrixDecodeEnabled, and ukPunctuationEnabled. Subscribed via atomic selectors to eliminate unnecessary component re-renders.</w:t>
+        <w:br/>
+        <w:br/>
+        <w:t>2. Rich Markdown Enhancements:</w:t>
+        <w:br/>
+        <w:t>Rendered with custom components for alternating zebra-striped tables with sticky headers, task lists with styled interactive checkboxes, KaTeX mathematical expressions, and Mermaid architectural diagrams.</w:t>
+        <w:br/>
+        <w:br/>
+        <w:t>3. System Prompt UK English Rules:</w:t>
+        <w:br/>
+        <w:t>Injected across all provider prompts: standard UK spellings (colour, organise, analyse, favour), eliminating em dashes in prose, and favoring short, direct clauses with commas, semicolons, or colons.</w:t>
+        <w:br/>
+        <w:br/>
+        <w:t>4. Code-Safe Punctuation Normaliser (normalisePunctuation):</w:t>
+        <w:br/>
+        <w:t>Post-processing AI output requires extreme caution so that source code is never mutated. The normaliser parses markdown into fenced code blocks (```...```), inline code spans (`...`), HTML tags, and prose segments. Em dashes (—) and spaced en dashes ( – ) are replaced with commas or hyphens strictly in prose segments. Fenced code, CLI flags (--option), language constructs (x--), and numeric ranges (1999–2005) remain 100% immutable.</w:t>
       </w:r>
     </w:p>
     <w:p>
@@ -1498,6 +1747,51 @@
     <w:p>
       <w:pPr>
         <w:keepNext/>
+        <w:spacing w:before="200" w:after="60"/>
+      </w:pPr>
+      <w:r>
+        <w:rPr>
+          <w:rFonts w:ascii="Segoe UI" w:hAnsi="Segoe UI"/>
+          <w:b/>
+          <w:color w:val="0F172A"/>
+          <w:sz w:val="23"/>
+        </w:rPr>
+        <w:t>Q: Why is programmatic smooth scrolling dangerous during high-speed AI streaming?</w:t>
+      </w:r>
+    </w:p>
+    <w:p>
+      <w:pPr>
+        <w:spacing w:after="80"/>
+      </w:pPr>
+      <w:r>
+        <w:rPr>
+          <w:i/>
+          <w:color w:val="64748B"/>
+          <w:sz w:val="19"/>
+        </w:rPr>
+        <w:t>Focus Area: DOM Animation Queueing &amp; Compositor Performance</w:t>
+      </w:r>
+    </w:p>
+    <w:p>
+      <w:pPr>
+        <w:spacing w:after="200"/>
+      </w:pPr>
+      <w:r>
+        <w:rPr>
+          <w:sz w:val="21"/>
+        </w:rPr>
+        <w:t>"A critical engineering gotcha we resolved was smooth scrolling animation queueing.</w:t>
+        <w:br/>
+        <w:br/>
+        <w:t>When an AI model streams at 150 to 300+ tokens per second, token buffer commits occur every 20 to 24ms. If the scroll container uses CSS 'scroll-behavior: smooth' or if code calls el.scrollTo({ behavior: 'smooth' }), the browser's layout engine attempts to interpolate between dozens of rapid height updates. These smooth scroll animations queue up in the compositor, creating severe frame drops, visual rubber-banding, and detached scroll states where the viewport lags far behind the live token stream.</w:t>
+        <w:br/>
+        <w:br/>
+        <w:t>We solved this by strictly enforcing behavior: 'auto' (instantaneous assignment) during all streaming flushes, setting .chat-feed { scroll-behavior: auto; }, and reserving smooth scrolling solely for discrete, user-initiated actions (such as clicking the 'Jump to latest' pill or submitting a new message)."</w:t>
+      </w:r>
+    </w:p>
+    <w:p>
+      <w:pPr>
+        <w:keepNext/>
         <w:spacing w:before="360" w:after="120"/>
         <w:pBdr>
           <w:bottom w:val="single" w:sz="8" w:space="4" w:color="CBD5E1"/>
@@ -1552,7 +1846,7 @@
           <w:rFonts w:ascii="Calibri" w:hAnsi="Calibri"/>
           <w:color w:val="334155"/>
         </w:rPr>
-        <w:t>Adapter Pattern (ProviderGateway), ReAct Loop (Agent Engine), Observer and Disposable Pattern (IPC Streaming), Selector Subscriptions (Zustand).</w:t>
+        <w:t>Adapter Pattern (ProviderGateway), ReAct Loop (Agent Engine), Observer and Disposable Pattern (IPC Streaming), Atomic Selector Subscriptions (Zustand), Self-Cancelling Animation Loop (ScrambleText).</w:t>
       </w:r>
     </w:p>
     <w:p>
@@ -1573,7 +1867,7 @@
           <w:rFonts w:ascii="Calibri" w:hAnsi="Calibri"/>
           <w:color w:val="334155"/>
         </w:rPr>
-        <w:t>Server-Sent Events (SSE), JSON-RPC 2.0 (Language Server Protocol), ANSI escape sequences (XTerm.js and node-pty), Electron IPC.</w:t>
+        <w:t>Server-Sent Events (SSE), JSON-RPC 2.0 (Language Server Protocol), ANSI escape sequences (XTerm.js and node-pty), Electron IPC, HTTPS keepAlive connection pooling.</w:t>
       </w:r>
     </w:p>
     <w:p>
@@ -1615,7 +1909,28 @@
           <w:rFonts w:ascii="Calibri" w:hAnsi="Calibri"/>
           <w:color w:val="334155"/>
         </w:rPr>
-        <w:t>Double-buffered token streaming with 24ms sync, Monaco Diff review gating, token auto-compaction at 95% threshold, atomic selector subscriptions.</w:t>
+        <w:t>Main Process token coalescing (16–24ms) with immediate Chunk #1 flush (0ms TTFT); Double-buffered 24ms rAF renderer flush; Smart sticky-scroll auto-follow with &lt;64px pin detection and zero-per-pixel re-renders; ResizeObserver height-jump isolation; Bounded 200-char Matrix Decode glyph scramble; CSS content-visibility: auto layout virtualization; Per-host HTTPS keepAlive socket reuse; Token auto-compaction at 95% threshold; Monaco Diff review gating.</w:t>
+      </w:r>
+    </w:p>
+    <w:p>
+      <w:pPr>
+        <w:spacing w:after="80"/>
+        <w:ind w:left="288"/>
+      </w:pPr>
+      <w:r>
+        <w:rPr>
+          <w:rFonts w:ascii="Calibri" w:hAnsi="Calibri"/>
+          <w:b/>
+          <w:color w:val="4F46E5"/>
+        </w:rPr>
+        <w:t xml:space="preserve">• Typography &amp; Text Processing: </w:t>
+      </w:r>
+      <w:r>
+        <w:rPr>
+          <w:rFonts w:ascii="Calibri" w:hAnsi="Calibri"/>
+          <w:color w:val="334155"/>
+        </w:rPr>
+        <w:t>Modular Zustand typography system (System Sans, Georgia Serif, JetBrains Mono, IBM Plex Mono); Code-safe UK English punctuation AST normaliser protecting fenced code blocks, inline spans, and CLI syntax.</w:t>
       </w:r>
     </w:p>
     <w:sectPr>

</xml_diff>